<commit_message>
sync: linux app from main (2026-06-22 22:52)
</commit_message>
<xml_diff>
--- a/linux_port/app/bundle/ПОДРОБНАЯ_ИНСТРУКЦИЯ_для_пользователя.docx
+++ b/linux_port/app/bundle/ПОДРОБНАЯ_ИНСТРУКЦИЯ_для_пользователя.docx
@@ -18,7 +18,7 @@
         <w:t>Версия программы:</w:t>
       </w:r>
       <w:r>
-        <w:t xml:space="preserve"> 1.4 (смотрите </w:t>
+        <w:t xml:space="preserve"> 1.5 (смотрите </w:t>
       </w:r>
       <w:r>
         <w:rPr>
@@ -87,6 +87,29 @@
       </w:r>
       <w:r>
         <w:t>).</w:t>
+      </w:r>
+    </w:p>
+    <w:p>
+      <w:r>
+        <w:t xml:space="preserve">История изменений по версиям — </w:t>
+      </w:r>
+      <w:r>
+        <w:rPr>
+          <w:b/>
+        </w:rPr>
+        <w:t>«Справка» → «Журнал доработок…»</w:t>
+      </w:r>
+      <w:r>
+        <w:t xml:space="preserve"> или файл </w:t>
+      </w:r>
+      <w:r>
+        <w:rPr>
+          <w:b/>
+        </w:rPr>
+        <w:t>ЖУРНАЛ_ДОРАБОТОК.md</w:t>
+      </w:r>
+      <w:r>
+        <w:t>.</w:t>
       </w:r>
     </w:p>
     <w:p/>
@@ -5913,6 +5936,26 @@
         <w:t>, время записи.</w:t>
       </w:r>
     </w:p>
+    <w:p>
+      <w:r>
+        <w:rPr>
+          <w:b/>
+        </w:rPr>
+        <w:t>С версии 1.5:</w:t>
+      </w:r>
+      <w:r>
+        <w:t xml:space="preserve"> при повторном формировании того же протокола (тот же № и дата) запись </w:t>
+      </w:r>
+      <w:r>
+        <w:rPr>
+          <w:b/>
+        </w:rPr>
+        <w:t>обновляется</w:t>
+      </w:r>
+      <w:r>
+        <w:t>, дубли в списке не показываются. Старые дубликаты удаляются из базы при запуске программы.</w:t>
+      </w:r>
+    </w:p>
     <w:tbl>
       <w:tblPr>
         <w:tblStyle w:val="TableGrid"/>
@@ -6230,6 +6273,182 @@
         <w:pStyle w:val="Heading2"/>
       </w:pPr>
       <w:r>
+        <w:t>Сохранённые профили комиссии (с 1.5)</w:t>
+      </w:r>
+    </w:p>
+    <w:p>
+      <w:r>
+        <w:t xml:space="preserve">Вверху окна — </w:t>
+      </w:r>
+      <w:r>
+        <w:rPr>
+          <w:b/>
+        </w:rPr>
+        <w:t>название профиля</w:t>
+      </w:r>
+      <w:r>
+        <w:t xml:space="preserve"> (подразделение), например «НПС и ЦТТ»:</w:t>
+      </w:r>
+    </w:p>
+    <w:tbl>
+      <w:tblPr>
+        <w:tblStyle w:val="TableGrid"/>
+        <w:tblW w:type="auto" w:w="0"/>
+        <w:tblLook w:firstColumn="1" w:firstRow="1" w:lastColumn="0" w:lastRow="0" w:noHBand="0" w:noVBand="1" w:val="04A0"/>
+      </w:tblPr>
+      <w:tblGrid>
+        <w:gridCol w:w="4320"/>
+        <w:gridCol w:w="4320"/>
+      </w:tblGrid>
+      <w:tr>
+        <w:tc>
+          <w:tcPr>
+            <w:tcW w:type="dxa" w:w="4320"/>
+          </w:tcPr>
+          <w:p>
+            <w:r/>
+            <w:r>
+              <w:t>Элемент</w:t>
+            </w:r>
+          </w:p>
+        </w:tc>
+        <w:tc>
+          <w:tcPr>
+            <w:tcW w:type="dxa" w:w="4320"/>
+          </w:tcPr>
+          <w:p>
+            <w:r/>
+            <w:r>
+              <w:t>Действие</w:t>
+            </w:r>
+          </w:p>
+        </w:tc>
+      </w:tr>
+      <w:tr>
+        <w:tc>
+          <w:tcPr>
+            <w:tcW w:type="dxa" w:w="4320"/>
+          </w:tcPr>
+          <w:p>
+            <w:r/>
+            <w:r>
+              <w:t>Выпадающий список / поле названия</w:t>
+            </w:r>
+          </w:p>
+        </w:tc>
+        <w:tc>
+          <w:tcPr>
+            <w:tcW w:type="dxa" w:w="4320"/>
+          </w:tcPr>
+          <w:p>
+            <w:r/>
+            <w:r>
+              <w:t>Выбор или ввод имени профиля</w:t>
+            </w:r>
+          </w:p>
+        </w:tc>
+      </w:tr>
+      <w:tr>
+        <w:tc>
+          <w:tcPr>
+            <w:tcW w:type="dxa" w:w="4320"/>
+          </w:tcPr>
+          <w:p>
+            <w:r/>
+            <w:r>
+              <w:rPr>
+                <w:b/>
+              </w:rPr>
+              <w:t>Загрузить</w:t>
+            </w:r>
+          </w:p>
+        </w:tc>
+        <w:tc>
+          <w:tcPr>
+            <w:tcW w:type="dxa" w:w="4320"/>
+          </w:tcPr>
+          <w:p>
+            <w:r/>
+            <w:r>
+              <w:t>Подставить сохранённый приказ и состав</w:t>
+            </w:r>
+          </w:p>
+        </w:tc>
+      </w:tr>
+      <w:tr>
+        <w:tc>
+          <w:tcPr>
+            <w:tcW w:type="dxa" w:w="4320"/>
+          </w:tcPr>
+          <w:p>
+            <w:r/>
+            <w:r>
+              <w:rPr>
+                <w:b/>
+              </w:rPr>
+              <w:t>Удалить профиль</w:t>
+            </w:r>
+          </w:p>
+        </w:tc>
+        <w:tc>
+          <w:tcPr>
+            <w:tcW w:type="dxa" w:w="4320"/>
+          </w:tcPr>
+          <w:p>
+            <w:r/>
+            <w:r>
+              <w:t>Удалить профиль из базы</w:t>
+            </w:r>
+          </w:p>
+        </w:tc>
+      </w:tr>
+      <w:tr>
+        <w:tc>
+          <w:tcPr>
+            <w:tcW w:type="dxa" w:w="4320"/>
+          </w:tcPr>
+          <w:p>
+            <w:r/>
+            <w:r>
+              <w:rPr>
+                <w:b/>
+              </w:rPr>
+              <w:t>Сохранить приказ и состав в базу данных</w:t>
+            </w:r>
+          </w:p>
+        </w:tc>
+        <w:tc>
+          <w:tcPr>
+            <w:tcW w:type="dxa" w:w="4320"/>
+          </w:tcPr>
+          <w:p>
+            <w:r/>
+            <w:r>
+              <w:t>Создать или обновить профиль и активную комиссию для протокола</w:t>
+            </w:r>
+          </w:p>
+        </w:tc>
+      </w:tr>
+    </w:tbl>
+    <w:p>
+      <w:r>
+        <w:t xml:space="preserve">Профили хранятся в `protocols.db`. Для вкладок «Охрана труда» и «Технич. вопросы» — </w:t>
+      </w:r>
+      <w:r>
+        <w:rPr>
+          <w:b/>
+        </w:rPr>
+        <w:t>отдельные</w:t>
+      </w:r>
+      <w:r>
+        <w:t xml:space="preserve"> списки.</w:t>
+      </w:r>
+    </w:p>
+    <w:p>
+      <w:pPr>
+        <w:pStyle w:val="Heading2"/>
+      </w:pPr>
+      <w:r>
         <w:t>Поля приказа и шапки</w:t>
       </w:r>
     </w:p>
@@ -6584,10 +6803,10 @@
         <w:rPr>
           <w:b/>
         </w:rPr>
-        <w:t>«Сохранить в базу»</w:t>
-      </w:r>
-      <w:r>
-        <w:t xml:space="preserve"> — запомнить состав. </w:t>
+        <w:t>«Сохранить приказ и состав в базу данных»</w:t>
+      </w:r>
+      <w:r>
+        <w:t xml:space="preserve"> — запомнить состав и профиль (если указано название). </w:t>
       </w:r>
       <w:r>
         <w:rPr>
@@ -7606,16 +7825,16 @@
         <w:pStyle w:val="ListNumber"/>
       </w:pPr>
       <w:r>
-        <w:t xml:space="preserve">В списке — записи из </w:t>
-      </w:r>
-      <w:r>
-        <w:rPr>
-          <w:b/>
-        </w:rPr>
-        <w:t>журнала</w:t>
-      </w:r>
-      <w:r>
-        <w:t xml:space="preserve"> протоколов. Выделите одну или несколько (</w:t>
+        <w:t xml:space="preserve">В списке — </w:t>
+      </w:r>
+      <w:r>
+        <w:rPr>
+          <w:b/>
+        </w:rPr>
+        <w:t>актуальные</w:t>
+      </w:r>
+      <w:r>
+        <w:t xml:space="preserve"> записи журнала (без дублей). Выделите одну или несколько (</w:t>
       </w:r>
       <w:r>
         <w:rPr>
@@ -7633,7 +7852,7 @@
         <w:t>Shift</w:t>
       </w:r>
       <w:r>
-        <w:t>).</w:t>
+        <w:t>). Пустой список — сначала сформируйте протокол по охране труда.</w:t>
       </w:r>
     </w:p>
     <w:p>
@@ -7673,10 +7892,19 @@
         <w:rPr>
           <w:b/>
         </w:rPr>
-        <w:t>«Выгрузить…»</w:t>
-      </w:r>
-      <w:r>
-        <w:t>, укажите имя файла.</w:t>
+        <w:t>«Сформировать шаблон Excel…»</w:t>
+      </w:r>
+      <w:r>
+        <w:t xml:space="preserve">, укажите файл. Содержимое листа </w:t>
+      </w:r>
+      <w:r>
+        <w:rPr>
+          <w:b/>
+        </w:rPr>
+        <w:t>заменяется</w:t>
+      </w:r>
+      <w:r>
+        <w:t xml:space="preserve"> данными выбранных записей (старый файл не дополняется автоматически).</w:t>
       </w:r>
     </w:p>
     <w:p>
@@ -8545,6 +8773,44 @@
             <w:r/>
             <w:r>
               <w:t>3</w:t>
+            </w:r>
+          </w:p>
+        </w:tc>
+        <w:tc>
+          <w:tcPr>
+            <w:tcW w:type="dxa" w:w="2880"/>
+          </w:tcPr>
+          <w:p>
+            <w:r/>
+            <w:r>
+              <w:rPr>
+                <w:b/>
+              </w:rPr>
+              <w:t>Журнал доработок…</w:t>
+            </w:r>
+          </w:p>
+        </w:tc>
+        <w:tc>
+          <w:tcPr>
+            <w:tcW w:type="dxa" w:w="2880"/>
+          </w:tcPr>
+          <w:p>
+            <w:r/>
+            <w:r>
+              <w:t>Что изменилось в каждой версии (с 1.4)</w:t>
+            </w:r>
+          </w:p>
+        </w:tc>
+      </w:tr>
+      <w:tr>
+        <w:tc>
+          <w:tcPr>
+            <w:tcW w:type="dxa" w:w="2880"/>
+          </w:tcPr>
+          <w:p>
+            <w:r/>
+            <w:r>
+              <w:t>4</w:t>
             </w:r>
           </w:p>
         </w:tc>
@@ -9724,7 +9990,7 @@
         <w:rPr>
           <w:i/>
         </w:rPr>
-        <w:t>Инструкция для программы ProtocolOOT, версия 1.4. При обновлении программы сверяйте пункты меню с экраном — в старых сборках названия могут отличаться.</w:t>
+        <w:t>Инструкция для программы ProtocolOOT, версия 1.5. При обновлении программы сверяйте пункты меню с экраном — в старых сборках названия могут отличаться.</w:t>
       </w:r>
     </w:p>
     <w:sectPr>

</xml_diff>

<commit_message>
sync: linux app v1.5 UI, bundle ODT/ODS, bundle_integration
Co-authored-by: Cursor <cursoragent@cursor.com>
</commit_message>
<xml_diff>
--- a/linux_port/app/bundle/ПОДРОБНАЯ_ИНСТРУКЦИЯ_для_пользователя.docx
+++ b/linux_port/app/bundle/ПОДРОБНАЯ_ИНСТРУКЦИЯ_для_пользователя.docx
@@ -507,7 +507,7 @@
       <w:r>
         <w:drawing>
           <wp:inline xmlns:a="http://schemas.openxmlformats.org/drawingml/2006/main" xmlns:pic="http://schemas.openxmlformats.org/drawingml/2006/picture">
-            <wp:extent cx="5669280" cy="4578560"/>
+            <wp:extent cx="5669280" cy="3985851"/>
             <wp:docPr id="1" name="Picture 1"/>
             <wp:cNvGraphicFramePr>
               <a:graphicFrameLocks noChangeAspect="1"/>
@@ -528,7 +528,7 @@
                   <pic:spPr>
                     <a:xfrm>
                       <a:off x="0" y="0"/>
-                      <a:ext cx="5669280" cy="4578560"/>
+                      <a:ext cx="5669280" cy="3985851"/>
                     </a:xfrm>
                     <a:prstGeom prst="rect"/>
                   </pic:spPr>
@@ -1419,7 +1419,7 @@
       <w:r>
         <w:drawing>
           <wp:inline xmlns:a="http://schemas.openxmlformats.org/drawingml/2006/main" xmlns:pic="http://schemas.openxmlformats.org/drawingml/2006/picture">
-            <wp:extent cx="5669280" cy="4578560"/>
+            <wp:extent cx="5669280" cy="3985851"/>
             <wp:docPr id="2" name="Picture 2"/>
             <wp:cNvGraphicFramePr>
               <a:graphicFrameLocks noChangeAspect="1"/>
@@ -1440,7 +1440,7 @@
                   <pic:spPr>
                     <a:xfrm>
                       <a:off x="0" y="0"/>
-                      <a:ext cx="5669280" cy="4578560"/>
+                      <a:ext cx="5669280" cy="3985851"/>
                     </a:xfrm>
                     <a:prstGeom prst="rect"/>
                   </pic:spPr>
@@ -2556,7 +2556,7 @@
       <w:r>
         <w:drawing>
           <wp:inline xmlns:a="http://schemas.openxmlformats.org/drawingml/2006/main" xmlns:pic="http://schemas.openxmlformats.org/drawingml/2006/picture">
-            <wp:extent cx="5669280" cy="4578560"/>
+            <wp:extent cx="5669280" cy="3985851"/>
             <wp:docPr id="3" name="Picture 3"/>
             <wp:cNvGraphicFramePr>
               <a:graphicFrameLocks noChangeAspect="1"/>
@@ -2577,7 +2577,7 @@
                   <pic:spPr>
                     <a:xfrm>
                       <a:off x="0" y="0"/>
-                      <a:ext cx="5669280" cy="4578560"/>
+                      <a:ext cx="5669280" cy="3985851"/>
                     </a:xfrm>
                     <a:prstGeom prst="rect"/>
                   </pic:spPr>
@@ -4743,7 +4743,7 @@
       <w:r>
         <w:drawing>
           <wp:inline xmlns:a="http://schemas.openxmlformats.org/drawingml/2006/main" xmlns:pic="http://schemas.openxmlformats.org/drawingml/2006/picture">
-            <wp:extent cx="5669280" cy="4895520"/>
+            <wp:extent cx="5669280" cy="4104097"/>
             <wp:docPr id="6" name="Picture 6"/>
             <wp:cNvGraphicFramePr>
               <a:graphicFrameLocks noChangeAspect="1"/>
@@ -4764,7 +4764,7 @@
                   <pic:spPr>
                     <a:xfrm>
                       <a:off x="0" y="0"/>
-                      <a:ext cx="5669280" cy="4895520"/>
+                      <a:ext cx="5669280" cy="4104097"/>
                     </a:xfrm>
                     <a:prstGeom prst="rect"/>
                   </pic:spPr>
@@ -5148,7 +5148,7 @@
       <w:r>
         <w:drawing>
           <wp:inline xmlns:a="http://schemas.openxmlformats.org/drawingml/2006/main" xmlns:pic="http://schemas.openxmlformats.org/drawingml/2006/picture">
-            <wp:extent cx="5669280" cy="4396779"/>
+            <wp:extent cx="5669280" cy="4484805"/>
             <wp:docPr id="7" name="Picture 7"/>
             <wp:cNvGraphicFramePr>
               <a:graphicFrameLocks noChangeAspect="1"/>
@@ -5169,7 +5169,7 @@
                   <pic:spPr>
                     <a:xfrm>
                       <a:off x="0" y="0"/>
-                      <a:ext cx="5669280" cy="4396779"/>
+                      <a:ext cx="5669280" cy="4484805"/>
                     </a:xfrm>
                     <a:prstGeom prst="rect"/>
                   </pic:spPr>
@@ -6126,7 +6126,7 @@
       <w:r>
         <w:drawing>
           <wp:inline xmlns:a="http://schemas.openxmlformats.org/drawingml/2006/main" xmlns:pic="http://schemas.openxmlformats.org/drawingml/2006/picture">
-            <wp:extent cx="5669280" cy="5192494"/>
+            <wp:extent cx="5669280" cy="7004091"/>
             <wp:docPr id="10" name="Picture 10"/>
             <wp:cNvGraphicFramePr>
               <a:graphicFrameLocks noChangeAspect="1"/>
@@ -6147,7 +6147,7 @@
                   <pic:spPr>
                     <a:xfrm>
                       <a:off x="0" y="0"/>
-                      <a:ext cx="5669280" cy="5192494"/>
+                      <a:ext cx="5669280" cy="7004091"/>
                     </a:xfrm>
                     <a:prstGeom prst="rect"/>
                   </pic:spPr>
@@ -6210,7 +6210,7 @@
       <w:r>
         <w:drawing>
           <wp:inline xmlns:a="http://schemas.openxmlformats.org/drawingml/2006/main" xmlns:pic="http://schemas.openxmlformats.org/drawingml/2006/picture">
-            <wp:extent cx="5669280" cy="5192494"/>
+            <wp:extent cx="5669280" cy="7004091"/>
             <wp:docPr id="11" name="Picture 11"/>
             <wp:cNvGraphicFramePr>
               <a:graphicFrameLocks noChangeAspect="1"/>
@@ -6231,7 +6231,7 @@
                   <pic:spPr>
                     <a:xfrm>
                       <a:off x="0" y="0"/>
-                      <a:ext cx="5669280" cy="5192494"/>
+                      <a:ext cx="5669280" cy="7004091"/>
                     </a:xfrm>
                     <a:prstGeom prst="rect"/>
                   </pic:spPr>
@@ -6892,11 +6892,11 @@
               <a:graphicData uri="http://schemas.openxmlformats.org/drawingml/2006/picture">
                 <pic:pic>
                   <pic:nvPicPr>
-                    <pic:cNvPr id="0" name="12_menu_administraciya.png"/>
+                    <pic:cNvPr id="0" name="13_menu_mintrud.png"/>
                     <pic:cNvPicPr/>
                   </pic:nvPicPr>
                   <pic:blipFill>
-                    <a:blip r:embed="rId13"/>
+                    <a:blip r:embed="rId19"/>
                     <a:stretch>
                       <a:fillRect/>
                     </a:stretch>
@@ -7194,7 +7194,7 @@
       <w:r>
         <w:drawing>
           <wp:inline xmlns:a="http://schemas.openxmlformats.org/drawingml/2006/main" xmlns:pic="http://schemas.openxmlformats.org/drawingml/2006/picture">
-            <wp:extent cx="5669280" cy="3742826"/>
+            <wp:extent cx="5669280" cy="3668358"/>
             <wp:docPr id="13" name="Picture 13"/>
             <wp:cNvGraphicFramePr>
               <a:graphicFrameLocks noChangeAspect="1"/>
@@ -7207,7 +7207,7 @@
                     <pic:cNvPicPr/>
                   </pic:nvPicPr>
                   <pic:blipFill>
-                    <a:blip r:embed="rId19"/>
+                    <a:blip r:embed="rId20"/>
                     <a:stretch>
                       <a:fillRect/>
                     </a:stretch>
@@ -7215,7 +7215,7 @@
                   <pic:spPr>
                     <a:xfrm>
                       <a:off x="0" y="0"/>
-                      <a:ext cx="5669280" cy="3742826"/>
+                      <a:ext cx="5669280" cy="3668358"/>
                     </a:xfrm>
                     <a:prstGeom prst="rect"/>
                   </pic:spPr>
@@ -7582,7 +7582,7 @@
       <w:r>
         <w:drawing>
           <wp:inline xmlns:a="http://schemas.openxmlformats.org/drawingml/2006/main" xmlns:pic="http://schemas.openxmlformats.org/drawingml/2006/picture">
-            <wp:extent cx="5669280" cy="4578560"/>
+            <wp:extent cx="5669280" cy="3985851"/>
             <wp:docPr id="14" name="Picture 14"/>
             <wp:cNvGraphicFramePr>
               <a:graphicFrameLocks noChangeAspect="1"/>
@@ -7603,7 +7603,7 @@
                   <pic:spPr>
                     <a:xfrm>
                       <a:off x="0" y="0"/>
-                      <a:ext cx="5669280" cy="4578560"/>
+                      <a:ext cx="5669280" cy="3985851"/>
                     </a:xfrm>
                     <a:prstGeom prst="rect"/>
                   </pic:spPr>
@@ -7744,7 +7744,7 @@
                     <pic:cNvPicPr/>
                   </pic:nvPicPr>
                   <pic:blipFill>
-                    <a:blip r:embed="rId20"/>
+                    <a:blip r:embed="rId21"/>
                     <a:stretch>
                       <a:fillRect/>
                     </a:stretch>
@@ -8607,11 +8607,11 @@
               <a:graphicData uri="http://schemas.openxmlformats.org/drawingml/2006/picture">
                 <pic:pic>
                   <pic:nvPicPr>
-                    <pic:cNvPr id="0" name="12_menu_administraciya.png"/>
+                    <pic:cNvPr id="0" name="14_menu_spravka.png"/>
                     <pic:cNvPicPr/>
                   </pic:nvPicPr>
                   <pic:blipFill>
-                    <a:blip r:embed="rId13"/>
+                    <a:blip r:embed="rId22"/>
                     <a:stretch>
                       <a:fillRect/>
                     </a:stretch>
@@ -8869,7 +8869,7 @@
                     <pic:cNvPicPr/>
                   </pic:nvPicPr>
                   <pic:blipFill>
-                    <a:blip r:embed="rId21"/>
+                    <a:blip r:embed="rId23"/>
                     <a:stretch>
                       <a:fillRect/>
                     </a:stretch>
@@ -8942,7 +8942,7 @@
                     <pic:cNvPicPr/>
                   </pic:nvPicPr>
                   <pic:blipFill>
-                    <a:blip r:embed="rId22"/>
+                    <a:blip r:embed="rId24"/>
                     <a:stretch>
                       <a:fillRect/>
                     </a:stretch>
@@ -9153,7 +9153,7 @@
                     <pic:cNvPicPr/>
                   </pic:nvPicPr>
                   <pic:blipFill>
-                    <a:blip r:embed="rId23"/>
+                    <a:blip r:embed="rId25"/>
                     <a:stretch>
                       <a:fillRect/>
                     </a:stretch>

</xml_diff>